<commit_message>
Fix HTML report disclaimer and false RAG findings on clean samples
- Restore the Chinese "不构成法律意见" disclaimer and the
  "待外部复核字段清单" heading in the HTML report; re-add the test
  assertion that was dropped.
- Only the top-ranked matched template contributes required clauses, so a
  complaint is no longer held to the service-contract clause list.
- Give the synthetic KB client client-star-river-tech its own credit code
  and legal representative; it previously reused the identifiers of the
  legacy sample client, flagging clean samples as profile mismatches.
  Regenerate demo case files (demo-cases-v3) to match.
- Document the supported Python range (3.10-3.12) in README.

Co-Authored-By: Claude Opus 5.5 <noreply@anthropic.com>
</commit_message>
<xml_diff>
--- a/demo_cases/files/clean_contract_pass/clean_contract_pass.docx
+++ b/demo_cases/files/clean_contract_pass/clean_contract_pass.docx
@@ -17,12 +17,12 @@
     </w:p>
     <w:p>
       <w:r>
-        <w:t>原告：上海星河科技股份有限公司，统一社会信用代码：91310000MA1K000001。</w:t>
+        <w:t>原告：上海星河科技股份有限公司，统一社会信用代码：91310115MA1RXH0026。</w:t>
       </w:r>
     </w:p>
     <w:p>
       <w:r>
-        <w:t>法定代表人：张明远。住所地：上海市浦东新区星港路88号12层。</w:t>
+        <w:t>法定代表人：沈牧舟。住所地：上海市浦东新区星港路88号12层。</w:t>
       </w:r>
     </w:p>
     <w:p>

</xml_diff>